<commit_message>
Drop the comma: COPD minor pathway, COPD major pathway
The comma read as an apposition rather than a name. The labels are now
"COPD minor pathway" and "COPD major pathway" throughout: the canonical
CATEGORY_DISPLAY map, the supplement legends, the manuscript prose and
both main tables, and the response report.

Eighteen replacements in the manuscript, none remaining with a comma.
Figure 1 is unaffected: its panels already read "minor pathway" and
"major pathway" without the COPD prefix, which does not fit the label
gutter.

Verification 136 of 136; the artifacts still carry the original factor
levels, so nothing in the registry moved.
</commit_message>
<xml_diff>
--- a/manuscript/ESI manuscript draft v15 2026.8.31_PJC.docx
+++ b/manuscript/ESI manuscript draft v15 2026.8.31_PJC.docx
@@ -1312,7 +1312,7 @@
           <w:rFonts w:eastAsia="Times New Roman"/>
           <w:lang w:eastAsia="it-IT"/>
         </w:rPr>
-        <w:t>) dyspnea score of 2 or greater, St. George’s Respiratory Questionnaire (SGRQ) total score of 25 or greater, and chronic bronchitis. Participants meeting the major criterion together with at least one minor criterion are classified as COPD, major pathway; participants meeting at least three of five minor criteria without the major criterion are classified as COPD, minor pathway; participants meeting the major criterion alone are classified as Airflow Limitation (AFL)-only-</w:t>
+        <w:t>) dyspnea score of 2 or greater, St. George’s Respiratory Questionnaire (SGRQ) total score of 25 or greater, and chronic bronchitis. Participants meeting the major criterion together with at least one minor criterion are classified as COPD major pathway; participants meeting at least three of five minor criteria without the major criterion are classified as COPD minor pathway; participants meeting the major criterion alone are classified as Airflow Limitation (AFL)-only-</w:t>
       </w:r>
       <w:proofErr w:type="spellStart"/>
       <w:r>
@@ -2448,7 +2448,7 @@
           <w:rFonts w:eastAsia="Times New Roman"/>
           <w:lang w:eastAsia="it-IT"/>
         </w:rPr>
-        <w:t>The original CT-based and ESI-based multidimensional classifications yielded comparable associations with mortality and prospective exacerbations (Table 1). Across outcomes, adjusted HRs and IRRs for COPD, minor pathway and COPD, major pathway categories were similar between the two frameworks, although for the COPD, major pathway group the CT-based classification did have a significantly higher HR for all-cause mortality and higher IRR for exacerbations. There was no significant difference between the two classifications for the COPD, minor pathway groups. Under both frameworks, the AFL-only-</w:t>
+        <w:t>The original CT-based and ESI-based multidimensional classifications yielded comparable associations with mortality and prospective exacerbations (Table 1). Across outcomes, adjusted HRs and IRRs for COPD minor pathway and COPD major pathway categories were similar between the two frameworks, although for the COPD major pathway group the CT-based classification did have a significantly higher HR for all-cause mortality and higher IRR for exacerbations. There was no significant difference between the two classifications for the COPD minor pathway groups. Under both frameworks, the AFL-only-</w:t>
       </w:r>
       <w:proofErr w:type="spellStart"/>
       <w:r>
@@ -2508,7 +2508,7 @@
           <w:rFonts w:eastAsia="Times New Roman"/>
           <w:lang w:eastAsia="it-IT"/>
         </w:rPr>
-        <w:t xml:space="preserve"> decline for COPD, minor pathway and COPD, major pathway were modest and not statistically significant after adjustment</w:t>
+        <w:t xml:space="preserve"> decline for COPD minor pathway and COPD major pathway were modest and not statistically significant after adjustment</w:t>
       </w:r>
       <w:r>
         <w:rPr>
@@ -5520,7 +5520,7 @@
           <w:bCs/>
           <w:sz w:val="20"/>
         </w:rPr>
-        <w:t>(A) Alluvial plot of participant flow between the four MD-COPD categories under the CT-based (left axis) and ESI-based (right axis) framework. Stratum block heights and ribbon widths are proportional to participant counts; ribbons are colored by CT-based origin so that a reader can trace where each CT-based category is reclassified under the ESI-based framework. (B) Cross-classification matrix of the same 9,402 participants (CT-based rows × ESI-based columns). Diagonal cells (concordant) are colored using the same Panel-A category palette; off-diagonal cells (discordant) are shown as white cells with the participant count and a light border. Cell opacity on the diagonal is proportional to count so that large concordant groups are visually dominant. Overall agreement between the two frameworks is 91% (κ = 0.82), with sensitivity 88% and specificity 94% for the ESI-based framework relative to the CT-based reference. Category labels are abbreviated within the panels to fit: COPD, minor pathway and COPD, major pathway appear as minor pathway and major pathway in Panel B, and as minor and major within the Panel A blocks. Abbreviations: ESI, Emphysema Severity Index; CT, computed tomography; AFL, airflow limitation; κ, Cohen's kappa coefficient.</w:t>
+        <w:t>(A) Alluvial plot of participant flow between the four MD-COPD categories under the CT-based (left axis) and ESI-based (right axis) framework. Stratum block heights and ribbon widths are proportional to participant counts; ribbons are colored by CT-based origin so that a reader can trace where each CT-based category is reclassified under the ESI-based framework. (B) Cross-classification matrix of the same 9,402 participants (CT-based rows × ESI-based columns). Diagonal cells (concordant) are colored using the same Panel-A category palette; off-diagonal cells (discordant) are shown as white cells with the participant count and a light border. Cell opacity on the diagonal is proportional to count so that large concordant groups are visually dominant. Overall agreement between the two frameworks is 91% (κ = 0.82), with sensitivity 88% and specificity 94% for the ESI-based framework relative to the CT-based reference. Category labels are abbreviated within the panels to fit: COPD minor pathway and COPD major pathway appear as minor pathway and major pathway in Panel B, and as minor and major within the Panel A blocks. Abbreviations: ESI, Emphysema Severity Index; CT, computed tomography; AFL, airflow limitation; κ, Cohen's kappa coefficient.</w:t>
       </w:r>
     </w:p>
     <w:p>
@@ -5813,7 +5813,7 @@
               <w:rPr>
                 <w:sz w:val="20"/>
               </w:rPr>
-              <w:t>COPD, minor pathway</w:t>
+              <w:t>COPD minor pathway</w:t>
             </w:r>
           </w:p>
         </w:tc>
@@ -5907,7 +5907,7 @@
               <w:rPr>
                 <w:sz w:val="20"/>
               </w:rPr>
-              <w:t>COPD, major pathway</w:t>
+              <w:t>COPD major pathway</w:t>
             </w:r>
           </w:p>
         </w:tc>
@@ -6008,7 +6008,7 @@
               <w:rPr>
                 <w:sz w:val="20"/>
               </w:rPr>
-              <w:t>COPD, minor pathway</w:t>
+              <w:t>COPD minor pathway</w:t>
             </w:r>
           </w:p>
         </w:tc>
@@ -6102,7 +6102,7 @@
               <w:rPr>
                 <w:sz w:val="20"/>
               </w:rPr>
-              <w:t>COPD, major pathway</w:t>
+              <w:t>COPD major pathway</w:t>
             </w:r>
           </w:p>
         </w:tc>
@@ -6203,7 +6203,7 @@
               <w:rPr>
                 <w:sz w:val="20"/>
               </w:rPr>
-              <w:t>COPD, minor pathway</w:t>
+              <w:t>COPD minor pathway</w:t>
             </w:r>
           </w:p>
         </w:tc>
@@ -6297,7 +6297,7 @@
               <w:rPr>
                 <w:sz w:val="20"/>
               </w:rPr>
-              <w:t>COPD, major pathway</w:t>
+              <w:t>COPD major pathway</w:t>
             </w:r>
           </w:p>
         </w:tc>
@@ -6410,7 +6410,7 @@
           <w:bCs/>
           <w:sz w:val="20"/>
         </w:rPr>
-        <w:t xml:space="preserve"> p-value for the difference in effect estimate between the CT-based and ESI-based framework fits for the same category (see Methods). Per category effect difference details are reported in Supplemental Table 2. Category sizes under the CT-based framework are noCOPD n = 4,203, AFL-only-noCOPD n = 170, COPD, minor pathway n = 1,086, and COPD, major pathway n = 3,943; the ESI-based categories contain different participants, and the full cross-classification is shown in Figure 1B. The AFL-only-</w:t>
+        <w:t xml:space="preserve"> p-value for the difference in effect estimate between the CT-based and ESI-based framework fits for the same category (see Methods). Per category effect difference details are reported in Supplemental Table 2. Category sizes under the CT-based framework are noCOPD n = 4,203, AFL-only-noCOPD n = 170, COPD minor pathway n = 1,086, and COPD major pathway n = 3,943; the ESI-based categories contain different participants, and the full cross-classification is shown in Figure 1B. The AFL-only-</w:t>
       </w:r>
       <w:proofErr w:type="spellStart"/>
       <w:r>

</xml_diff>

<commit_message>
Regroup the Table 1 outcome column across three rows
The outcome column was vertically merged in pairs, one span per outcome
across its two category rows. Restoring AFL-only-noCOPD made each
outcome three rows, and the old spans then aliased: three outcome labels
rendered against the wrong data. Stripping the merges fixed that but
left the label repeating on every row.

The column is merged again, now in threes, with the label in the restart
cell and the two continuation cells empty. Verified at the XML level,
restart on rows 1, 4 and 7 with continue beneath each, and in a rendered
PDF where each outcome appears once beside its three categories.
</commit_message>
<xml_diff>
--- a/manuscript/ESI manuscript draft v15 2026.8.31_PJC.docx
+++ b/manuscript/ESI manuscript draft v15 2026.8.31_PJC.docx
@@ -5838,6 +5838,7 @@
               <w:bottom w:val="nil"/>
               <w:right w:val="single" w:sz="6" w:space="0" w:color="000000"/>
             </w:tcBorders>
+            <w:vMerge w:val="restart"/>
           </w:tcPr>
           <w:p>
             <w:r>
@@ -5985,16 +5986,9 @@
               <w:bottom w:val="single" w:sz="6" w:space="0" w:color="000000"/>
               <w:right w:val="single" w:sz="6" w:space="0" w:color="000000"/>
             </w:tcBorders>
+            <w:vMerge/>
           </w:tcPr>
-          <w:p>
-            <w:r>
-              <w:rPr>
-                <w:rFonts w:ascii="Arial" w:hAnsi="Arial" w:cs="Arial"/>
-                <w:sz w:val="18"/>
-              </w:rPr>
-              <w:t xml:space="preserve">All-cause mortality (HR)</w:t>
-            </w:r>
-          </w:p>
+          <w:p/>
         </w:tc>
         <w:tc>
           <w:tcPr>
@@ -6132,16 +6126,9 @@
               <w:bottom w:val="nil"/>
               <w:right w:val="single" w:sz="6" w:space="0" w:color="000000"/>
             </w:tcBorders>
+            <w:vMerge/>
           </w:tcPr>
-          <w:p>
-            <w:r>
-              <w:rPr>
-                <w:rFonts w:ascii="Arial" w:hAnsi="Arial" w:cs="Arial"/>
-                <w:sz w:val="18"/>
-              </w:rPr>
-              <w:t xml:space="preserve">All-cause mortality (HR)</w:t>
-            </w:r>
-          </w:p>
+          <w:p/>
         </w:tc>
         <w:tc>
           <w:tcPr>
@@ -6279,6 +6266,7 @@
               <w:bottom w:val="single" w:sz="6" w:space="0" w:color="000000"/>
               <w:right w:val="single" w:sz="6" w:space="0" w:color="000000"/>
             </w:tcBorders>
+            <w:vMerge w:val="restart"/>
           </w:tcPr>
           <w:p>
             <w:r>
@@ -6426,16 +6414,9 @@
               <w:bottom w:val="nil"/>
               <w:right w:val="single" w:sz="6" w:space="0" w:color="000000"/>
             </w:tcBorders>
+            <w:vMerge/>
           </w:tcPr>
-          <w:p>
-            <w:r>
-              <w:rPr>
-                <w:rFonts w:ascii="Arial" w:hAnsi="Arial" w:cs="Arial"/>
-                <w:sz w:val="18"/>
-              </w:rPr>
-              <w:t xml:space="preserve">Respiratory mortality (HR)</w:t>
-            </w:r>
-          </w:p>
+          <w:p/>
         </w:tc>
         <w:tc>
           <w:tcPr>
@@ -6573,16 +6554,9 @@
               <w:bottom w:val="single" w:sz="6" w:space="0" w:color="000000"/>
               <w:right w:val="single" w:sz="6" w:space="0" w:color="000000"/>
             </w:tcBorders>
+            <w:vMerge/>
           </w:tcPr>
-          <w:p>
-            <w:r>
-              <w:rPr>
-                <w:rFonts w:ascii="Arial" w:hAnsi="Arial" w:cs="Arial"/>
-                <w:sz w:val="18"/>
-              </w:rPr>
-              <w:t xml:space="preserve">Respiratory mortality (HR)</w:t>
-            </w:r>
-          </w:p>
+          <w:p/>
         </w:tc>
         <w:tc>
           <w:tcPr>
@@ -6711,6 +6685,7 @@
         <w:tc>
           <w:tcPr>
             <w:tcW w:type="dxa" w:w="1656"/>
+            <w:vMerge w:val="restart"/>
           </w:tcPr>
           <w:p>
             <w:r>
@@ -6825,16 +6800,9 @@
         <w:tc>
           <w:tcPr>
             <w:tcW w:type="dxa" w:w="1656"/>
+            <w:vMerge/>
           </w:tcPr>
-          <w:p>
-            <w:r>
-              <w:rPr>
-                <w:rFonts w:ascii="Arial" w:hAnsi="Arial" w:cs="Arial"/>
-                <w:sz w:val="18"/>
-              </w:rPr>
-              <w:t xml:space="preserve">Exacerbations (IRR)</w:t>
-            </w:r>
-          </w:p>
+          <w:p/>
         </w:tc>
         <w:tc>
           <w:tcPr>
@@ -6939,16 +6907,9 @@
         <w:tc>
           <w:tcPr>
             <w:tcW w:type="dxa" w:w="1656"/>
+            <w:vMerge/>
           </w:tcPr>
-          <w:p>
-            <w:r>
-              <w:rPr>
-                <w:rFonts w:ascii="Arial" w:hAnsi="Arial" w:cs="Arial"/>
-                <w:sz w:val="18"/>
-              </w:rPr>
-              <w:t xml:space="preserve">Exacerbations (IRR)</w:t>
-            </w:r>
-          </w:p>
+          <w:p/>
         </w:tc>
         <w:tc>
           <w:tcPr>

</xml_diff>